<commit_message>
Add local passphrase change setting
Co-authored-by: Copilot <223556219+Copilot@users.noreply.github.com>
</commit_message>
<xml_diff>
--- a/Return Visits & Contacts App Master Guide (V5).docx
+++ b/Return Visits & Contacts App Master Guide (V5).docx
@@ -132,7 +132,7 @@
     <w:p>
       <w:pPr/>
       <w:r>
-        <w:t>On first use, existing legacy data is encrypted and verified before the old plaintext copies are removed. A passphrase is required each time the app opens. There is no password reset or recovery; losing the passphrase makes the encrypted records and backups unreadable.</w:t>
+        <w:t>On first use, existing legacy data is encrypted and verified before the old plaintext copies are removed. A passphrase is required each time the app opens. In Settings, a user can change the passphrase for the current local app copy by entering the existing passphrase and confirming a new passphrase of at least eight characters. The settings and contacts are decrypted, re-encrypted with fresh encryption metadata, verified, and replaced atomically. Other browser/Home Screen copies and already-exported backups are not changed. There is no passphrase recovery; losing the current passphrase before changing it makes that copy's encrypted records unreadable.</w:t>
       </w:r>
     </w:p>
     <w:p>
@@ -146,7 +146,7 @@
     <w:p>
       <w:pPr/>
       <w:r>
-        <w:t>On first launch, create and confirm a passphrase of at least eight characters. On subsequent launches, enter that passphrase to unlock the database. Keep the passphrase private and store it somewhere safe; the app cannot recover it.</w:t>
+        <w:t>On first launch, create and confirm a passphrase of at least eight characters. On subsequent launches, enter that passphrase to unlock the database. To change it, open Settings, enter the current passphrase, and enter and confirm a new passphrase. Existing exported backups continue to use the passphrase with which each backup was created.</w:t>
       </w:r>
     </w:p>
     <w:p>

</xml_diff>

<commit_message>
Clarify contact pin location choices
Co-authored-by: Copilot <223556219+Copilot@users.noreply.github.com>
</commit_message>
<xml_diff>
--- a/Return Visits & Contacts App Master Guide (V5).docx
+++ b/Return Visits & Contacts App Master Guide (V5).docx
@@ -198,13 +198,13 @@
     <w:p>
       <w:pPr/>
       <w:r>
-        <w:t>Map coordinates are optional. The user can choose Get GPS, enter an address and deliberately select Find Address on Map, tap the map, or drag the pin. Contact creation and editing do not request location automatically.</w:t>
-      </w:r>
-    </w:p>
-    <w:p>
-      <w:pPr/>
-      <w:r>
-        <w:t>Address search sends the entered search query to OpenStreetMap Nominatim only after the user selects Find Address on Map. Device GPS requires browser permission. Map tiles and externally hosted Leaflet assets require an internet connection.</w:t>
+        <w:t>Map coordinates are optional. In the contact form, the user can choose Use Device Location to request device GPS or Set Pin from Entered Address to look up the entered street address, city, and state. GPS requests high accuracy with no cached location, but actual accuracy varies and is reported when available. The user can refine any pin by tapping the map, dragging it, or editing coordinates. Contact creation and editing do not request location automatically.</w:t>
+      </w:r>
+    </w:p>
+    <w:p>
+      <w:pPr/>
+      <w:r>
+        <w:t>Address search sends the entered search query to OpenStreetMap Nominatim only after the user selects Set Pin from Entered Address. Device location requires browser permission. Map tiles and externally hosted Leaflet assets require an internet connection.</w:t>
       </w:r>
     </w:p>
     <w:p>

</xml_diff>

<commit_message>
Add cross-street pin lookup fallback
Co-authored-by: Copilot <223556219+Copilot@users.noreply.github.com>
</commit_message>
<xml_diff>
--- a/Return Visits & Contacts App Master Guide (V5).docx
+++ b/Return Visits & Contacts App Master Guide (V5).docx
@@ -198,13 +198,13 @@
     <w:p>
       <w:pPr/>
       <w:r>
-        <w:t>Map coordinates are optional. In the contact form, the user can choose Use Device Location to request device GPS or Set Pin from Entered Address to look up the entered street address, city, and state. GPS requests high accuracy with no cached location, but actual accuracy varies and is reported when available. The user can refine any pin by tapping the map, dragging it, or editing coordinates. Contact creation and editing do not request location automatically.</w:t>
-      </w:r>
-    </w:p>
-    <w:p>
-      <w:pPr/>
-      <w:r>
-        <w:t>Address search sends the entered search query to OpenStreetMap Nominatim only after the user selects Set Pin from Entered Address. Device location requires browser permission. Map tiles and externally hosted Leaflet assets require an internet connection.</w:t>
+        <w:t>Map coordinates are optional. In the contact form, the user can choose Use Device Location to request device GPS or Set Pin from Entered Address to look up the entered street address, city, and state. GPS requests high accuracy with no cached location, but actual accuracy varies and is reported when available. If the street address is not found, the app tries to center the map near the selected city and state. The user can then enter a nearby cross-street or intersection and explicitly search for a closer pin. Pins can also be dragged on the Map view, where their new coordinates save automatically. The user can refine pins in the contact form by tapping the map, dragging the pin, or editing coordinates. Contact creation and editing do not request location automatically.</w:t>
+      </w:r>
+    </w:p>
+    <w:p>
+      <w:pPr/>
+      <w:r>
+        <w:t>Address and city searches are sent to OpenStreetMap Nominatim only after the user selects Set Pin from Entered Address. A cross-street or intersection query is sent only after the user selects Search Near Cross-Street. Device location requires browser permission. Map tiles and externally hosted Leaflet assets require an internet connection.</w:t>
       </w:r>
     </w:p>
     <w:p>

</xml_diff>

<commit_message>
Add contact email phone and navigation
Co-authored-by: Copilot <223556219+Copilot@users.noreply.github.com>
</commit_message>
<xml_diff>
--- a/Return Visits & Contacts App Master Guide (V5).docx
+++ b/Return Visits & Contacts App Master Guide (V5).docx
@@ -166,19 +166,19 @@
     <w:p>
       <w:pPr/>
       <w:r>
-        <w:t>A contact includes a stable unique ID, creation time, first name (required), optional last name, street-address text, optional city, state, optional region and area, optional latitude and longitude, and visit history. A contact can have at most one city, one region, and one area. Region requires a city; area requires a region. Location fields can be completed or edited later without changing the contact ID. Different contacts may share the same name. Separate phone-number and email fields are not currently implemented.</w:t>
-      </w:r>
-    </w:p>
-    <w:p>
-      <w:pPr/>
-      <w:r>
-        <w:t>A visit-log entry stores an ID, timestamp, display date, and note text. Logs display newest first and can be edited or deleted. New logs can be added from the contact form or quickly from a contact card. The card provides edit, encrypted export, print, and delete actions.</w:t>
-      </w:r>
-    </w:p>
-    <w:p>
-      <w:pPr/>
-      <w:r>
-        <w:t>The contact list supports text search over names, address, visit-note text, and assigned areas; urgency, city, region, and area filters; and newest-first, oldest-first, and first-name alphabetical sorting. City, region, and area filters follow the same hierarchy. Print Visible Contacts prints exactly the contacts shown by the current search and filters, confirms the count, groups each contact once under their most specific location, and includes only the latest visit note. The printer-friendly layout omits app controls.</w:t>
+        <w:t>A contact includes a stable unique ID, creation time, first name (required), optional last name, email, phone, street-address text, optional city, state, optional region and area, optional latitude and longitude, and visit history. Email and phone are optional; U.S. phone numbers use the format (555) 123-4567. A contact can have at most one city, one region, and one area. Region requires a city; area requires a region. Location fields can be completed or edited later without changing the contact ID. Different contacts may share the same name.</w:t>
+      </w:r>
+    </w:p>
+    <w:p>
+      <w:pPr/>
+      <w:r>
+        <w:t>A visit-log entry stores an ID, timestamp, display date, and note text. Logs display newest first and can be edited or deleted. New logs can be added from the contact form or quickly from a contact card. The card provides edit, encrypted export, print, navigate, and delete actions. Navigate opens Google Maps directions using saved coordinates when available, or the contact address otherwise.</w:t>
+      </w:r>
+    </w:p>
+    <w:p>
+      <w:pPr/>
+      <w:r>
+        <w:t>The contact list supports text search over names, email, phone, address, visit-note text, and assigned areas; urgency, city, region, and area filters; and newest-first, oldest-first, and first-name alphabetical sorting. City, region, and area filters follow the same hierarchy. Print Visible Contacts prints exactly the contacts shown by the current search and filters, confirms the count, groups each contact once under their most specific location, and includes available phone and email details plus only the latest visit note. The printer-friendly layout omits app controls.</w:t>
       </w:r>
     </w:p>
     <w:p>

</xml_diff>

<commit_message>
Explain app scope and phone setup
Co-authored-by: Copilot <223556219+Copilot@users.noreply.github.com>
</commit_message>
<xml_diff>
--- a/Return Visits & Contacts App Master Guide (V5).docx
+++ b/Return Visits & Contacts App Master Guide (V5).docx
@@ -100,7 +100,7 @@
     <w:p>
       <w:pPr/>
       <w:r>
-        <w:t>Return Visits is a client-side Progressive Web App for keeping contact details, visit notes, and map locations on the user’s device. Each browser/device has its own independent dataset. There are no user accounts, server-side contact records, or automatic cross-device synchronization.</w:t>
+        <w:t>Return Visits is a free-to-use client-side Progressive Web App with no app fees or subscription. It is intentionally a simple tool for maintaining contact details and tracking return visits, not a full-featured contact-management app, and may have fewer features or be less reliable than paid products. It is provided as-is. Internet/mobile data and third-party services remain subject to their providers' charges and terms. The app keeps contact details, visit notes, and map locations on the user's device. Each browser/device has its own independent dataset. There are no user accounts, server-side contact records, or automatic cross-device synchronization.</w:t>
       </w:r>
     </w:p>
     <w:p>
@@ -288,7 +288,7 @@
     <w:p>
       <w:pPr/>
       <w:r>
-        <w:t>The app can be used in a regular browser; PWA installation is optional. On iPhone, open the HTTPS site in Safari, use Share, then Add to Home Screen. On Android, use the browser’s Install app or Add to Home Screen option.</w:t>
+        <w:t>The app can be used in a regular browser; PWA installation is optional. For the best iPhone Home Screen app experience, open the HTTPS site in Safari, use Share, then Add to Home Screen. If the link opened inside another app, use its menu to open it in Safari; a website cannot force the browser. On Android, open the site in Chrome and use Install app or Add to Home Screen. Browser and Home Screen copies may store separate data, so set up the preferred copy before entering contacts or back up before switching.</w:t>
       </w:r>
     </w:p>
     <w:p>

</xml_diff>

<commit_message>
Improve address lookup and map pins
Co-authored-by: Copilot <223556219+Copilot@users.noreply.github.com>
</commit_message>
<xml_diff>
--- a/Return Visits & Contacts App Master Guide (V5).docx
+++ b/Return Visits & Contacts App Master Guide (V5).docx
@@ -198,13 +198,13 @@
     <w:p>
       <w:pPr/>
       <w:r>
-        <w:t>Map coordinates are optional. In the contact form, the user can choose Use Device Location to request device GPS or Set Pin from Entered Address to look up the entered street address, city, and state. GPS requests high accuracy with no cached location, but actual accuracy varies and is reported when available. If the street address is not found, the app tries to center the map near the selected city and state. The user can then enter a nearby cross-street or intersection and explicitly search for a closer pin. Pins can also be dragged on the Map view, where their new coordinates save automatically. The user can refine pins in the contact form by tapping the map, dragging the pin, or editing coordinates. Contact creation and editing do not request location automatically.</w:t>
-      </w:r>
-    </w:p>
-    <w:p>
-      <w:pPr/>
-      <w:r>
-        <w:t>Address and city searches are sent to OpenStreetMap Nominatim only after the user selects Set Pin from Entered Address. A cross-street or intersection query is sent only after the user selects Search Near Cross-Street. Device location requires browser permission. Map tiles and externally hosted Leaflet assets require an internet connection.</w:t>
+        <w:t>Map coordinates are optional. In the contact form, the user can choose Use Device Location to request device GPS or Find Address or City Pin to search the entered street address, city, and state. GPS requests high accuracy with no cached location, but actual accuracy varies and is reported when available. If a partial street address has multiple matches, the user chooses the correct result; the matching full street name is filled in and a pin is placed. If no full-address match is found, the app also searches by the street name without its leading house number. A city-only search places an approximate city pin. The user can also search a nearby cross-street or intersection, or refine pins by tapping the contact form map, dragging the pin, or editing coordinates. Pins can be dragged on the Map view, where their new coordinates save automatically. Contact creation and editing do not request location automatically; contacts without coordinates have no map pin.</w:t>
+      </w:r>
+    </w:p>
+    <w:p>
+      <w:pPr/>
+      <w:r>
+        <w:t>Address, partial street-name, and city searches are sent to OpenStreetMap Nominatim only after the user selects Find Address or City Pin. A cross-street or intersection query is sent only after the user selects Search Near Cross-Street. Device location requires browser permission. Map tiles and externally hosted Leaflet assets require an internet connection.</w:t>
       </w:r>
     </w:p>
     <w:p>

</xml_diff>

<commit_message>
Center empty map on default city
Co-authored-by: Copilot <223556219+Copilot@users.noreply.github.com>
</commit_message>
<xml_diff>
--- a/Return Visits & Contacts App Master Guide (V5).docx
+++ b/Return Visits & Contacts App Master Guide (V5).docx
@@ -198,7 +198,7 @@
     <w:p>
       <w:pPr/>
       <w:r>
-        <w:t>Map coordinates are optional. In the contact form, the user can choose Use Device Location to request device GPS or Find Address or City Pin to search the entered street address, city, and state. GPS requests high accuracy with no cached location, but actual accuracy varies and is reported when available. If a partial street address has multiple matches, the user chooses the correct result; the matching full street name is filled in and a pin is placed. If no full-address match is found, the app also searches by the street name without its leading house number. A city-only search places an approximate city pin. The user can also search a nearby cross-street or intersection, or refine pins by tapping the contact form map, dragging the pin, or editing coordinates. Pins can be dragged on the Map view, where their new coordinates save automatically. Contact creation and editing do not request location automatically; contacts without coordinates have no map pin.</w:t>
+        <w:t>Map coordinates are optional. In the contact form, the user can choose Use Device Location to request device GPS or Find Address or City Pin to search the entered street address, city, and state. GPS requests high accuracy with no cached location, but actual accuracy varies and is reported when available. If a partial street address has multiple matches, the user chooses the correct result; the matching full street name is filled in and a pin is placed. If no full-address match is found, the app also searches by the street name without its leading house number. A city-only search places an approximate city pin. The user can also search a nearby cross-street or intersection, or refine pins by tapping the contact form map, dragging the pin, or editing coordinates. Pins can be dragged on the Map view, where their new coordinates save automatically. Contact creation and editing do not request location automatically; contacts without coordinates have no map pin. Whenever the Map is open with no visible contact pins, it centers approximately on the default city and state in Settings and sends that city and state to Nominatim for the lookup.</w:t>
       </w:r>
       <w:r>
         <w:t xml:space="preserve"> Street addresses and newly entered location names are capitalized when the user leaves the field or saves; recognized U.S. state names are stored as standard two-letter abbreviations, and state codes are uppercased.</w:t>
@@ -210,7 +210,7 @@
     <w:p>
       <w:pPr/>
       <w:r>
-        <w:t>Address, partial street-name, and city searches are sent to OpenStreetMap Nominatim only after the user selects Find Address or City Pin. A cross-street or intersection query is sent only after the user selects Search Near Cross-Street. Device location requires browser permission. Map tiles and externally hosted Leaflet assets require an internet connection.</w:t>
+        <w:t>Address, partial street-name, and city searches are sent to OpenStreetMap Nominatim only after the user selects Find Address or City Pin. A cross-street or intersection query is sent only after the user selects Search Near Cross-Street. Whenever the Map is open with no visible contact pins, the default city and state are sent to Nominatim to center the map approximately. Device location requires browser permission. Map tiles and externally hosted Leaflet assets require an internet connection.</w:t>
       </w:r>
     </w:p>
     <w:p>

</xml_diff>

<commit_message>
Make passphrase optional and allow turning it on later
Co-authored-by: Copilot <223556219+Copilot@users.noreply.github.com>
</commit_message>
<xml_diff>
--- a/Return Visits & Contacts App Master Guide (V5).docx
+++ b/Return Visits & Contacts App Master Guide (V5).docx
@@ -132,7 +132,7 @@
     <w:p>
       <w:pPr/>
       <w:r>
-        <w:t>On first use, existing legacy data is encrypted and verified before the old plaintext copies are removed. A passphrase is required each time the app opens. In Settings, a user can change the passphrase for the current local app copy by entering the existing passphrase and confirming a new passphrase of at least eight characters. The settings and contacts are decrypted, re-encrypted with fresh encryption metadata, verified, and replaced atomically. Other browser/Home Screen copies and already-exported backups are not changed. There is no passphrase recovery; losing the current passphrase before changing it makes that copy's encrypted records unreadable.</w:t>
+        <w:t>A passphrase is optional and is off by default; without one, the app opens immediately and stores settings and contacts unencrypted. A user can turn on a passphrase in Settings by choosing and confirming a passphrase of at least eight characters; the existing data is encrypted and verified before the unencrypted copies are replaced. Once a passphrase is on, it is required each time the app opens. A user can then change it by entering the existing passphrase and confirming a new one of at least eight characters. The settings and contacts are decrypted, re-encrypted with fresh encryption metadata, verified, and replaced atomically. Other browser/Home Screen copies and already-exported backups are not changed. There is no passphrase recovery; losing the current passphrase before changing it makes that copy's encrypted records unreadable.</w:t>
       </w:r>
     </w:p>
     <w:p>
@@ -146,7 +146,7 @@
     <w:p>
       <w:pPr/>
       <w:r>
-        <w:t>On first launch, create and confirm a passphrase of at least eight characters. On subsequent launches, enter that passphrase to unlock the database. To change it, open Settings, enter the current passphrase, and enter and confirm a new passphrase. Existing exported backups continue to use the passphrase with which each backup was created.</w:t>
+        <w:t>No passphrase is required on first launch; the app opens directly. To protect the data, open Settings, choose Turn On Passphrase, and enter and confirm a passphrase of at least eight characters. On later launches, enter that passphrase to unlock the database. To change it, open Settings, enter the current passphrase, and enter and confirm a new passphrase. Existing exported backups continue to use the passphrase with which each backup was created.</w:t>
       </w:r>
     </w:p>
     <w:p>
@@ -242,13 +242,13 @@
     <w:p>
       <w:pPr/>
       <w:r>
-        <w:t>Choose Settings → Export Data Backup to download an encrypted JSON backup of settings and all contacts. The backup is encrypted and requires its passphrase to restore. The browser chooses the download destination; the app cannot select a folder. On iPhone, check Files → Downloads; elsewhere, check the browser’s Downloads location.</w:t>
-      </w:r>
-    </w:p>
-    <w:p>
-      <w:pPr/>
-      <w:r>
-        <w:t>Restore can be started from Settings or from the first-use unlock screen on a new device. Enter the backup passphrase and confirm replacement when prompted. Restore replaces the current local dataset; on a fresh device, the restored backup passphrase becomes the passphrase used to unlock that data.</w:t>
+        <w:t>Choose Settings → Export Data Backup to download a JSON backup of settings and all contacts. If a passphrase is on, the backup is encrypted and requires its passphrase to restore; otherwise it is an unencrypted backup. The browser chooses the download destination; the app cannot select a folder. On iPhone, check Files → Downloads; elsewhere, check the browser’s Downloads location.</w:t>
+      </w:r>
+    </w:p>
+    <w:p>
+      <w:pPr/>
+      <w:r>
+        <w:t>Restore can be started from Settings or, when a passphrase is on, from the unlock screen on a new device. For an encrypted backup, enter the backup passphrase; unencrypted backups need none. Confirm replacement when prompted. Restore replaces the current local dataset; on a fresh device that uses a passphrase, the restored backup passphrase becomes the passphrase used to unlock that data.</w:t>
       </w:r>
     </w:p>
     <w:p>
@@ -280,7 +280,7 @@
     <w:p>
       <w:pPr/>
       <w:r>
-        <w:t>The recipient can use the regular website or install the PWA. In Settings → Share a Contact, choose the encrypted file, enter its sharing passphrase, and confirm import. Import adds a new contact without replacing existing contacts, assigns a local ID, and stores it encrypted with the recipient device’s passphrase.</w:t>
+        <w:t>The recipient can use the regular website or install the PWA. In Settings → Share a Contact, choose the encrypted file, enter its sharing passphrase, and confirm import. Import adds a new contact without replacing existing contacts, assigns a local ID, and stores it using the recipient device’s settings (encrypted if the recipient has turned on a passphrase).</w:t>
       </w:r>
     </w:p>
     <w:p>

</xml_diff>